<commit_message>
Fiche V7B : lune pleine pour le référent, demi-lune pour les contributeurs
Co-Authored-By: Claude Opus 5.5 <noreply@anthropic.com>
Claude-Session: https://claude.ai/code/session_01Uq61dqYr6RDM7NVErLzuSJ
</commit_message>
<xml_diff>
--- a/documents/Fiche_Koungou_Nord_V7B_tableau.docx
+++ b/documents/Fiche_Koungou_Nord_V7B_tableau.docx
@@ -2666,14 +2666,12 @@
             </w:pPr>
             <w:r>
               <w:rPr>
-                <w:rFonts w:ascii="Calibri" w:cs="Calibri" w:eastAsia="Calibri" w:hAnsi="Calibri"/>
-                <w:b/>
-                <w:bCs/>
+                <w:rFonts w:ascii="Segoe UI Symbol" w:cs="Segoe UI Symbol" w:eastAsia="Segoe UI Symbol" w:hAnsi="Segoe UI Symbol"/>
                 <w:color w:val="15803D"/>
-                <w:sz w:val="22"/>
-                <w:szCs w:val="22"/>
-              </w:rPr>
-              <w:t xml:space="preserve">○</w:t>
+                <w:sz w:val="24"/>
+                <w:szCs w:val="24"/>
+              </w:rPr>
+              <w:t xml:space="preserve">◐</w:t>
             </w:r>
           </w:p>
         </w:tc>
@@ -2703,7 +2701,7 @@
             </w:pPr>
             <w:r>
               <w:rPr>
-                <w:rFonts w:ascii="Calibri" w:cs="Calibri" w:eastAsia="Calibri" w:hAnsi="Calibri"/>
+                <w:rFonts w:ascii="Segoe UI Symbol" w:cs="Segoe UI Symbol" w:eastAsia="Segoe UI Symbol" w:hAnsi="Segoe UI Symbol"/>
                 <w:color w:val="1D4ED8"/>
                 <w:sz w:val="26"/>
                 <w:szCs w:val="26"/>
@@ -2947,14 +2945,12 @@
             </w:pPr>
             <w:r>
               <w:rPr>
-                <w:rFonts w:ascii="Calibri" w:cs="Calibri" w:eastAsia="Calibri" w:hAnsi="Calibri"/>
-                <w:b/>
-                <w:bCs/>
+                <w:rFonts w:ascii="Segoe UI Symbol" w:cs="Segoe UI Symbol" w:eastAsia="Segoe UI Symbol" w:hAnsi="Segoe UI Symbol"/>
                 <w:color w:val="15803D"/>
-                <w:sz w:val="22"/>
-                <w:szCs w:val="22"/>
-              </w:rPr>
-              <w:t xml:space="preserve">○</w:t>
+                <w:sz w:val="24"/>
+                <w:szCs w:val="24"/>
+              </w:rPr>
+              <w:t xml:space="preserve">◐</w:t>
             </w:r>
           </w:p>
         </w:tc>
@@ -3018,7 +3014,7 @@
             </w:pPr>
             <w:r>
               <w:rPr>
-                <w:rFonts w:ascii="Calibri" w:cs="Calibri" w:eastAsia="Calibri" w:hAnsi="Calibri"/>
+                <w:rFonts w:ascii="Segoe UI Symbol" w:cs="Segoe UI Symbol" w:eastAsia="Segoe UI Symbol" w:hAnsi="Segoe UI Symbol"/>
                 <w:color w:val="7E22CE"/>
                 <w:sz w:val="26"/>
                 <w:szCs w:val="26"/>
@@ -3365,7 +3361,7 @@
             </w:pPr>
             <w:r>
               <w:rPr>
-                <w:rFonts w:ascii="Calibri" w:cs="Calibri" w:eastAsia="Calibri" w:hAnsi="Calibri"/>
+                <w:rFonts w:ascii="Segoe UI Symbol" w:cs="Segoe UI Symbol" w:eastAsia="Segoe UI Symbol" w:hAnsi="Segoe UI Symbol"/>
                 <w:color w:val="BE185D"/>
                 <w:sz w:val="26"/>
                 <w:szCs w:val="26"/>
@@ -3644,7 +3640,7 @@
             </w:pPr>
             <w:r>
               <w:rPr>
-                <w:rFonts w:ascii="Calibri" w:cs="Calibri" w:eastAsia="Calibri" w:hAnsi="Calibri"/>
+                <w:rFonts w:ascii="Segoe UI Symbol" w:cs="Segoe UI Symbol" w:eastAsia="Segoe UI Symbol" w:hAnsi="Segoe UI Symbol"/>
                 <w:color w:val="BE185D"/>
                 <w:sz w:val="26"/>
                 <w:szCs w:val="26"/>
@@ -3821,7 +3817,7 @@
             </w:pPr>
             <w:r>
               <w:rPr>
-                <w:rFonts w:ascii="Calibri" w:cs="Calibri" w:eastAsia="Calibri" w:hAnsi="Calibri"/>
+                <w:rFonts w:ascii="Segoe UI Symbol" w:cs="Segoe UI Symbol" w:eastAsia="Segoe UI Symbol" w:hAnsi="Segoe UI Symbol"/>
                 <w:color w:val="1D4ED8"/>
                 <w:sz w:val="26"/>
                 <w:szCs w:val="26"/>
@@ -3923,14 +3919,12 @@
             </w:pPr>
             <w:r>
               <w:rPr>
-                <w:rFonts w:ascii="Calibri" w:cs="Calibri" w:eastAsia="Calibri" w:hAnsi="Calibri"/>
-                <w:b/>
-                <w:bCs/>
+                <w:rFonts w:ascii="Segoe UI Symbol" w:cs="Segoe UI Symbol" w:eastAsia="Segoe UI Symbol" w:hAnsi="Segoe UI Symbol"/>
                 <w:color w:val="BE185D"/>
-                <w:sz w:val="22"/>
-                <w:szCs w:val="22"/>
-              </w:rPr>
-              <w:t xml:space="preserve">○</w:t>
+                <w:sz w:val="24"/>
+                <w:szCs w:val="24"/>
+              </w:rPr>
+              <w:t xml:space="preserve">◐</w:t>
             </w:r>
           </w:p>
         </w:tc>
@@ -4170,7 +4164,7 @@
             </w:pPr>
             <w:r>
               <w:rPr>
-                <w:rFonts w:ascii="Calibri" w:cs="Calibri" w:eastAsia="Calibri" w:hAnsi="Calibri"/>
+                <w:rFonts w:ascii="Segoe UI Symbol" w:cs="Segoe UI Symbol" w:eastAsia="Segoe UI Symbol" w:hAnsi="Segoe UI Symbol"/>
                 <w:color w:val="C2410C"/>
                 <w:sz w:val="26"/>
                 <w:szCs w:val="26"/>
@@ -4239,7 +4233,7 @@
             </w:pPr>
             <w:r>
               <w:rPr>
-                <w:rFonts w:ascii="Calibri" w:cs="Calibri" w:eastAsia="Calibri" w:hAnsi="Calibri"/>
+                <w:rFonts w:ascii="Segoe UI Symbol" w:cs="Segoe UI Symbol" w:eastAsia="Segoe UI Symbol" w:hAnsi="Segoe UI Symbol"/>
                 <w:color w:val="134E4A"/>
                 <w:sz w:val="26"/>
                 <w:szCs w:val="26"/>
@@ -4348,7 +4342,7 @@
             </w:pPr>
             <w:r>
               <w:rPr>
-                <w:rFonts w:ascii="Calibri" w:cs="Calibri" w:eastAsia="Calibri" w:hAnsi="Calibri"/>
+                <w:rFonts w:ascii="Segoe UI Symbol" w:cs="Segoe UI Symbol" w:eastAsia="Segoe UI Symbol" w:hAnsi="Segoe UI Symbol"/>
                 <w:color w:val="15803D"/>
                 <w:sz w:val="26"/>
                 <w:szCs w:val="26"/>
@@ -4695,7 +4689,7 @@
             </w:pPr>
             <w:r>
               <w:rPr>
-                <w:rFonts w:ascii="Calibri" w:cs="Calibri" w:eastAsia="Calibri" w:hAnsi="Calibri"/>
+                <w:rFonts w:ascii="Segoe UI Symbol" w:cs="Segoe UI Symbol" w:eastAsia="Segoe UI Symbol" w:hAnsi="Segoe UI Symbol"/>
                 <w:color w:val="7E22CE"/>
                 <w:sz w:val="26"/>
                 <w:szCs w:val="26"/>
@@ -4832,7 +4826,7 @@
             </w:pPr>
             <w:r>
               <w:rPr>
-                <w:rFonts w:ascii="Calibri" w:cs="Calibri" w:eastAsia="Calibri" w:hAnsi="Calibri"/>
+                <w:rFonts w:ascii="Segoe UI Symbol" w:cs="Segoe UI Symbol" w:eastAsia="Segoe UI Symbol" w:hAnsi="Segoe UI Symbol"/>
                 <w:color w:val="A16207"/>
                 <w:sz w:val="26"/>
                 <w:szCs w:val="26"/>
@@ -4974,14 +4968,12 @@
             </w:pPr>
             <w:r>
               <w:rPr>
-                <w:rFonts w:ascii="Calibri" w:cs="Calibri" w:eastAsia="Calibri" w:hAnsi="Calibri"/>
-                <w:b/>
-                <w:bCs/>
+                <w:rFonts w:ascii="Segoe UI Symbol" w:cs="Segoe UI Symbol" w:eastAsia="Segoe UI Symbol" w:hAnsi="Segoe UI Symbol"/>
                 <w:color w:val="7E22CE"/>
-                <w:sz w:val="22"/>
-                <w:szCs w:val="22"/>
-              </w:rPr>
-              <w:t xml:space="preserve">○</w:t>
+                <w:sz w:val="24"/>
+                <w:szCs w:val="24"/>
+              </w:rPr>
+              <w:t xml:space="preserve">◐</w:t>
             </w:r>
           </w:p>
         </w:tc>
@@ -5079,7 +5071,7 @@
             </w:pPr>
             <w:r>
               <w:rPr>
-                <w:rFonts w:ascii="Calibri" w:cs="Calibri" w:eastAsia="Calibri" w:hAnsi="Calibri"/>
+                <w:rFonts w:ascii="Segoe UI Symbol" w:cs="Segoe UI Symbol" w:eastAsia="Segoe UI Symbol" w:hAnsi="Segoe UI Symbol"/>
                 <w:color w:val="134E4A"/>
                 <w:sz w:val="26"/>
                 <w:szCs w:val="26"/>
@@ -5114,7 +5106,7 @@
             </w:pPr>
             <w:r>
               <w:rPr>
-                <w:rFonts w:ascii="Calibri" w:cs="Calibri" w:eastAsia="Calibri" w:hAnsi="Calibri"/>
+                <w:rFonts w:ascii="Segoe UI Symbol" w:cs="Segoe UI Symbol" w:eastAsia="Segoe UI Symbol" w:hAnsi="Segoe UI Symbol"/>
                 <w:color w:val="A16207"/>
                 <w:sz w:val="26"/>
                 <w:szCs w:val="26"/>
@@ -5233,7 +5225,7 @@
             </w:pPr>
             <w:r>
               <w:rPr>
-                <w:rFonts w:ascii="Calibri" w:cs="Calibri" w:eastAsia="Calibri" w:hAnsi="Calibri"/>
+                <w:rFonts w:ascii="Segoe UI Symbol" w:cs="Segoe UI Symbol" w:eastAsia="Segoe UI Symbol" w:hAnsi="Segoe UI Symbol"/>
                 <w:color w:val="15803D"/>
                 <w:sz w:val="26"/>
                 <w:szCs w:val="26"/>
@@ -5580,7 +5572,7 @@
             </w:pPr>
             <w:r>
               <w:rPr>
-                <w:rFonts w:ascii="Calibri" w:cs="Calibri" w:eastAsia="Calibri" w:hAnsi="Calibri"/>
+                <w:rFonts w:ascii="Segoe UI Symbol" w:cs="Segoe UI Symbol" w:eastAsia="Segoe UI Symbol" w:hAnsi="Segoe UI Symbol"/>
                 <w:color w:val="7E22CE"/>
                 <w:sz w:val="26"/>
                 <w:szCs w:val="26"/>
@@ -5614,14 +5606,12 @@
             </w:pPr>
             <w:r>
               <w:rPr>
-                <w:rFonts w:ascii="Calibri" w:cs="Calibri" w:eastAsia="Calibri" w:hAnsi="Calibri"/>
-                <w:b/>
-                <w:bCs/>
+                <w:rFonts w:ascii="Segoe UI Symbol" w:cs="Segoe UI Symbol" w:eastAsia="Segoe UI Symbol" w:hAnsi="Segoe UI Symbol"/>
                 <w:color w:val="C2410C"/>
-                <w:sz w:val="22"/>
-                <w:szCs w:val="22"/>
-              </w:rPr>
-              <w:t xml:space="preserve">○</w:t>
+                <w:sz w:val="24"/>
+                <w:szCs w:val="24"/>
+              </w:rPr>
+              <w:t xml:space="preserve">◐</w:t>
             </w:r>
           </w:p>
         </w:tc>
@@ -5929,7 +5919,7 @@
             </w:pPr>
             <w:r>
               <w:rPr>
-                <w:rFonts w:ascii="Calibri" w:cs="Calibri" w:eastAsia="Calibri" w:hAnsi="Calibri"/>
+                <w:rFonts w:ascii="Segoe UI Symbol" w:cs="Segoe UI Symbol" w:eastAsia="Segoe UI Symbol" w:hAnsi="Segoe UI Symbol"/>
                 <w:color w:val="BE185D"/>
                 <w:sz w:val="26"/>
                 <w:szCs w:val="26"/>
@@ -6252,7 +6242,7 @@
             </w:pPr>
             <w:r>
               <w:rPr>
-                <w:rFonts w:ascii="Calibri" w:cs="Calibri" w:eastAsia="Calibri" w:hAnsi="Calibri"/>
+                <w:rFonts w:ascii="Segoe UI Symbol" w:cs="Segoe UI Symbol" w:eastAsia="Segoe UI Symbol" w:hAnsi="Segoe UI Symbol"/>
                 <w:color w:val="BE185D"/>
                 <w:sz w:val="26"/>
                 <w:szCs w:val="26"/>
@@ -6429,7 +6419,7 @@
             </w:pPr>
             <w:r>
               <w:rPr>
-                <w:rFonts w:ascii="Calibri" w:cs="Calibri" w:eastAsia="Calibri" w:hAnsi="Calibri"/>
+                <w:rFonts w:ascii="Segoe UI Symbol" w:cs="Segoe UI Symbol" w:eastAsia="Segoe UI Symbol" w:hAnsi="Segoe UI Symbol"/>
                 <w:color w:val="1D4ED8"/>
                 <w:sz w:val="26"/>
                 <w:szCs w:val="26"/>
@@ -6674,7 +6664,7 @@
             </w:pPr>
             <w:r>
               <w:rPr>
-                <w:rFonts w:ascii="Calibri" w:cs="Calibri" w:eastAsia="Calibri" w:hAnsi="Calibri"/>
+                <w:rFonts w:ascii="Segoe UI Symbol" w:cs="Segoe UI Symbol" w:eastAsia="Segoe UI Symbol" w:hAnsi="Segoe UI Symbol"/>
                 <w:color w:val="15803D"/>
                 <w:sz w:val="26"/>
                 <w:szCs w:val="26"/>
@@ -7031,7 +7021,7 @@
             </w:pPr>
             <w:r>
               <w:rPr>
-                <w:rFonts w:ascii="Calibri" w:cs="Calibri" w:eastAsia="Calibri" w:hAnsi="Calibri"/>
+                <w:rFonts w:ascii="Segoe UI Symbol" w:cs="Segoe UI Symbol" w:eastAsia="Segoe UI Symbol" w:hAnsi="Segoe UI Symbol"/>
                 <w:color w:val="1D4ED8"/>
                 <w:sz w:val="26"/>
                 <w:szCs w:val="26"/>
@@ -7099,14 +7089,12 @@
             </w:pPr>
             <w:r>
               <w:rPr>
-                <w:rFonts w:ascii="Calibri" w:cs="Calibri" w:eastAsia="Calibri" w:hAnsi="Calibri"/>
-                <w:b/>
-                <w:bCs/>
+                <w:rFonts w:ascii="Segoe UI Symbol" w:cs="Segoe UI Symbol" w:eastAsia="Segoe UI Symbol" w:hAnsi="Segoe UI Symbol"/>
                 <w:color w:val="C2410C"/>
-                <w:sz w:val="22"/>
-                <w:szCs w:val="22"/>
-              </w:rPr>
-              <w:t xml:space="preserve">○</w:t>
+                <w:sz w:val="24"/>
+                <w:szCs w:val="24"/>
+              </w:rPr>
+              <w:t xml:space="preserve">◐</w:t>
             </w:r>
           </w:p>
         </w:tc>
@@ -7277,14 +7265,12 @@
             </w:pPr>
             <w:r>
               <w:rPr>
-                <w:rFonts w:ascii="Calibri" w:cs="Calibri" w:eastAsia="Calibri" w:hAnsi="Calibri"/>
-                <w:b/>
-                <w:bCs/>
+                <w:rFonts w:ascii="Segoe UI Symbol" w:cs="Segoe UI Symbol" w:eastAsia="Segoe UI Symbol" w:hAnsi="Segoe UI Symbol"/>
                 <w:color w:val="15803D"/>
-                <w:sz w:val="22"/>
-                <w:szCs w:val="22"/>
-              </w:rPr>
-              <w:t xml:space="preserve">○</w:t>
+                <w:sz w:val="24"/>
+                <w:szCs w:val="24"/>
+              </w:rPr>
+              <w:t xml:space="preserve">◐</w:t>
             </w:r>
           </w:p>
         </w:tc>
@@ -7314,7 +7300,7 @@
             </w:pPr>
             <w:r>
               <w:rPr>
-                <w:rFonts w:ascii="Calibri" w:cs="Calibri" w:eastAsia="Calibri" w:hAnsi="Calibri"/>
+                <w:rFonts w:ascii="Segoe UI Symbol" w:cs="Segoe UI Symbol" w:eastAsia="Segoe UI Symbol" w:hAnsi="Segoe UI Symbol"/>
                 <w:color w:val="1D4ED8"/>
                 <w:sz w:val="26"/>
                 <w:szCs w:val="26"/>
@@ -7348,86 +7334,80 @@
             </w:pPr>
             <w:r>
               <w:rPr>
-                <w:rFonts w:ascii="Calibri" w:cs="Calibri" w:eastAsia="Calibri" w:hAnsi="Calibri"/>
-                <w:b/>
-                <w:bCs/>
+                <w:rFonts w:ascii="Segoe UI Symbol" w:cs="Segoe UI Symbol" w:eastAsia="Segoe UI Symbol" w:hAnsi="Segoe UI Symbol"/>
                 <w:color w:val="7E22CE"/>
-                <w:sz w:val="22"/>
-                <w:szCs w:val="22"/>
-              </w:rPr>
-              <w:t xml:space="preserve">○</w:t>
-            </w:r>
-          </w:p>
-        </w:tc>
-        <w:tc>
-          <w:tcPr>
-            <w:tcW w:type="dxa" w:w="1043"/>
-            <w:tcBorders>
-              <w:top w:val="none" w:color="auto" w:sz="0"/>
-              <w:left w:val="single" w:color="FFFFFF" w:sz="12"/>
-              <w:bottom w:val="single" w:color="D3E0DE" w:sz="4"/>
-              <w:right w:val="none" w:color="auto" w:sz="0"/>
-            </w:tcBorders>
-            <w:tcMar>
-              <w:top w:type="dxa" w:w="10"/>
-              <w:left w:type="dxa" w:w="0"/>
-              <w:bottom w:type="dxa" w:w="10"/>
-              <w:right w:type="dxa" w:w="0"/>
-            </w:tcMar>
-            <w:vAlign w:val="center"/>
-          </w:tcPr>
-          <w:p>
-            <w:pPr>
-              <w:keepLines/>
-              <w:spacing w:after="0" w:before="0" w:line="220" w:lineRule="auto"/>
-              <w:jc w:val="center"/>
-            </w:pPr>
-            <w:r>
-              <w:rPr>
-                <w:rFonts w:ascii="Calibri" w:cs="Calibri" w:eastAsia="Calibri" w:hAnsi="Calibri"/>
-                <w:b/>
-                <w:bCs/>
+                <w:sz w:val="24"/>
+                <w:szCs w:val="24"/>
+              </w:rPr>
+              <w:t xml:space="preserve">◐</w:t>
+            </w:r>
+          </w:p>
+        </w:tc>
+        <w:tc>
+          <w:tcPr>
+            <w:tcW w:type="dxa" w:w="1043"/>
+            <w:tcBorders>
+              <w:top w:val="none" w:color="auto" w:sz="0"/>
+              <w:left w:val="single" w:color="FFFFFF" w:sz="12"/>
+              <w:bottom w:val="single" w:color="D3E0DE" w:sz="4"/>
+              <w:right w:val="none" w:color="auto" w:sz="0"/>
+            </w:tcBorders>
+            <w:tcMar>
+              <w:top w:type="dxa" w:w="10"/>
+              <w:left w:type="dxa" w:w="0"/>
+              <w:bottom w:type="dxa" w:w="10"/>
+              <w:right w:type="dxa" w:w="0"/>
+            </w:tcMar>
+            <w:vAlign w:val="center"/>
+          </w:tcPr>
+          <w:p>
+            <w:pPr>
+              <w:keepLines/>
+              <w:spacing w:after="0" w:before="0" w:line="220" w:lineRule="auto"/>
+              <w:jc w:val="center"/>
+            </w:pPr>
+            <w:r>
+              <w:rPr>
+                <w:rFonts w:ascii="Segoe UI Symbol" w:cs="Segoe UI Symbol" w:eastAsia="Segoe UI Symbol" w:hAnsi="Segoe UI Symbol"/>
                 <w:color w:val="C2410C"/>
-                <w:sz w:val="22"/>
-                <w:szCs w:val="22"/>
-              </w:rPr>
-              <w:t xml:space="preserve">○</w:t>
-            </w:r>
-          </w:p>
-        </w:tc>
-        <w:tc>
-          <w:tcPr>
-            <w:tcW w:type="dxa" w:w="1043"/>
-            <w:tcBorders>
-              <w:top w:val="none" w:color="auto" w:sz="0"/>
-              <w:left w:val="single" w:color="FFFFFF" w:sz="12"/>
-              <w:bottom w:val="single" w:color="D3E0DE" w:sz="4"/>
-              <w:right w:val="none" w:color="auto" w:sz="0"/>
-            </w:tcBorders>
-            <w:tcMar>
-              <w:top w:type="dxa" w:w="10"/>
-              <w:left w:type="dxa" w:w="0"/>
-              <w:bottom w:type="dxa" w:w="10"/>
-              <w:right w:type="dxa" w:w="0"/>
-            </w:tcMar>
-            <w:vAlign w:val="center"/>
-          </w:tcPr>
-          <w:p>
-            <w:pPr>
-              <w:keepLines/>
-              <w:spacing w:after="0" w:before="0" w:line="220" w:lineRule="auto"/>
-              <w:jc w:val="center"/>
-            </w:pPr>
-            <w:r>
-              <w:rPr>
-                <w:rFonts w:ascii="Calibri" w:cs="Calibri" w:eastAsia="Calibri" w:hAnsi="Calibri"/>
-                <w:b/>
-                <w:bCs/>
+                <w:sz w:val="24"/>
+                <w:szCs w:val="24"/>
+              </w:rPr>
+              <w:t xml:space="preserve">◐</w:t>
+            </w:r>
+          </w:p>
+        </w:tc>
+        <w:tc>
+          <w:tcPr>
+            <w:tcW w:type="dxa" w:w="1043"/>
+            <w:tcBorders>
+              <w:top w:val="none" w:color="auto" w:sz="0"/>
+              <w:left w:val="single" w:color="FFFFFF" w:sz="12"/>
+              <w:bottom w:val="single" w:color="D3E0DE" w:sz="4"/>
+              <w:right w:val="none" w:color="auto" w:sz="0"/>
+            </w:tcBorders>
+            <w:tcMar>
+              <w:top w:type="dxa" w:w="10"/>
+              <w:left w:type="dxa" w:w="0"/>
+              <w:bottom w:type="dxa" w:w="10"/>
+              <w:right w:type="dxa" w:w="0"/>
+            </w:tcMar>
+            <w:vAlign w:val="center"/>
+          </w:tcPr>
+          <w:p>
+            <w:pPr>
+              <w:keepLines/>
+              <w:spacing w:after="0" w:before="0" w:line="220" w:lineRule="auto"/>
+              <w:jc w:val="center"/>
+            </w:pPr>
+            <w:r>
+              <w:rPr>
+                <w:rFonts w:ascii="Segoe UI Symbol" w:cs="Segoe UI Symbol" w:eastAsia="Segoe UI Symbol" w:hAnsi="Segoe UI Symbol"/>
                 <w:color w:val="BE185D"/>
-                <w:sz w:val="22"/>
-                <w:szCs w:val="22"/>
-              </w:rPr>
-              <w:t xml:space="preserve">○</w:t>
+                <w:sz w:val="24"/>
+                <w:szCs w:val="24"/>
+              </w:rPr>
+              <w:t xml:space="preserve">◐</w:t>
             </w:r>
           </w:p>
         </w:tc>
@@ -7457,7 +7437,7 @@
             </w:pPr>
             <w:r>
               <w:rPr>
-                <w:rFonts w:ascii="Calibri" w:cs="Calibri" w:eastAsia="Calibri" w:hAnsi="Calibri"/>
+                <w:rFonts w:ascii="Segoe UI Symbol" w:cs="Segoe UI Symbol" w:eastAsia="Segoe UI Symbol" w:hAnsi="Segoe UI Symbol"/>
                 <w:color w:val="134E4A"/>
                 <w:sz w:val="26"/>
                 <w:szCs w:val="26"/>
@@ -7566,7 +7546,7 @@
             </w:pPr>
             <w:r>
               <w:rPr>
-                <w:rFonts w:ascii="Calibri" w:cs="Calibri" w:eastAsia="Calibri" w:hAnsi="Calibri"/>
+                <w:rFonts w:ascii="Segoe UI Symbol" w:cs="Segoe UI Symbol" w:eastAsia="Segoe UI Symbol" w:hAnsi="Segoe UI Symbol"/>
                 <w:color w:val="15803D"/>
                 <w:sz w:val="26"/>
                 <w:szCs w:val="26"/>
@@ -7981,7 +7961,7 @@
             </w:pPr>
             <w:r>
               <w:rPr>
-                <w:rFonts w:ascii="Calibri" w:cs="Calibri" w:eastAsia="Calibri" w:hAnsi="Calibri"/>
+                <w:rFonts w:ascii="Segoe UI Symbol" w:cs="Segoe UI Symbol" w:eastAsia="Segoe UI Symbol" w:hAnsi="Segoe UI Symbol"/>
                 <w:color w:val="BE185D"/>
                 <w:sz w:val="26"/>
                 <w:szCs w:val="26"/>
@@ -8226,7 +8206,7 @@
             </w:pPr>
             <w:r>
               <w:rPr>
-                <w:rFonts w:ascii="Calibri" w:cs="Calibri" w:eastAsia="Calibri" w:hAnsi="Calibri"/>
+                <w:rFonts w:ascii="Segoe UI Symbol" w:cs="Segoe UI Symbol" w:eastAsia="Segoe UI Symbol" w:hAnsi="Segoe UI Symbol"/>
                 <w:color w:val="C2410C"/>
                 <w:sz w:val="26"/>
                 <w:szCs w:val="26"/>
@@ -8436,14 +8416,12 @@
             </w:pPr>
             <w:r>
               <w:rPr>
-                <w:rFonts w:ascii="Calibri" w:cs="Calibri" w:eastAsia="Calibri" w:hAnsi="Calibri"/>
-                <w:b/>
-                <w:bCs/>
+                <w:rFonts w:ascii="Segoe UI Symbol" w:cs="Segoe UI Symbol" w:eastAsia="Segoe UI Symbol" w:hAnsi="Segoe UI Symbol"/>
                 <w:color w:val="1D4ED8"/>
-                <w:sz w:val="22"/>
-                <w:szCs w:val="22"/>
-              </w:rPr>
-              <w:t xml:space="preserve">○</w:t>
+                <w:sz w:val="24"/>
+                <w:szCs w:val="24"/>
+              </w:rPr>
+              <w:t xml:space="preserve">◐</w:t>
             </w:r>
           </w:p>
         </w:tc>
@@ -8541,7 +8519,7 @@
             </w:pPr>
             <w:r>
               <w:rPr>
-                <w:rFonts w:ascii="Calibri" w:cs="Calibri" w:eastAsia="Calibri" w:hAnsi="Calibri"/>
+                <w:rFonts w:ascii="Segoe UI Symbol" w:cs="Segoe UI Symbol" w:eastAsia="Segoe UI Symbol" w:hAnsi="Segoe UI Symbol"/>
                 <w:color w:val="BE185D"/>
                 <w:sz w:val="26"/>
                 <w:szCs w:val="26"/>
@@ -8683,158 +8661,148 @@
             </w:pPr>
             <w:r>
               <w:rPr>
-                <w:rFonts w:ascii="Calibri" w:cs="Calibri" w:eastAsia="Calibri" w:hAnsi="Calibri"/>
-                <w:b/>
-                <w:bCs/>
+                <w:rFonts w:ascii="Segoe UI Symbol" w:cs="Segoe UI Symbol" w:eastAsia="Segoe UI Symbol" w:hAnsi="Segoe UI Symbol"/>
                 <w:color w:val="15803D"/>
-                <w:sz w:val="22"/>
-                <w:szCs w:val="22"/>
-              </w:rPr>
-              <w:t xml:space="preserve">○</w:t>
-            </w:r>
-          </w:p>
-        </w:tc>
-        <w:tc>
-          <w:tcPr>
-            <w:tcW w:type="dxa" w:w="1043"/>
-            <w:tcBorders>
-              <w:top w:val="none" w:color="auto" w:sz="0"/>
-              <w:left w:val="single" w:color="FFFFFF" w:sz="12"/>
-              <w:bottom w:val="single" w:color="D3E0DE" w:sz="4"/>
-              <w:right w:val="none" w:color="auto" w:sz="0"/>
-            </w:tcBorders>
-            <w:tcMar>
-              <w:top w:type="dxa" w:w="10"/>
-              <w:left w:type="dxa" w:w="0"/>
-              <w:bottom w:type="dxa" w:w="10"/>
-              <w:right w:type="dxa" w:w="0"/>
-            </w:tcMar>
-            <w:vAlign w:val="center"/>
-          </w:tcPr>
-          <w:p>
-            <w:pPr>
-              <w:keepLines/>
-              <w:spacing w:after="0" w:before="0" w:line="220" w:lineRule="auto"/>
-              <w:jc w:val="center"/>
-            </w:pPr>
-            <w:r>
-              <w:rPr>
-                <w:rFonts w:ascii="Calibri" w:cs="Calibri" w:eastAsia="Calibri" w:hAnsi="Calibri"/>
-                <w:b/>
-                <w:bCs/>
+                <w:sz w:val="24"/>
+                <w:szCs w:val="24"/>
+              </w:rPr>
+              <w:t xml:space="preserve">◐</w:t>
+            </w:r>
+          </w:p>
+        </w:tc>
+        <w:tc>
+          <w:tcPr>
+            <w:tcW w:type="dxa" w:w="1043"/>
+            <w:tcBorders>
+              <w:top w:val="none" w:color="auto" w:sz="0"/>
+              <w:left w:val="single" w:color="FFFFFF" w:sz="12"/>
+              <w:bottom w:val="single" w:color="D3E0DE" w:sz="4"/>
+              <w:right w:val="none" w:color="auto" w:sz="0"/>
+            </w:tcBorders>
+            <w:tcMar>
+              <w:top w:type="dxa" w:w="10"/>
+              <w:left w:type="dxa" w:w="0"/>
+              <w:bottom w:type="dxa" w:w="10"/>
+              <w:right w:type="dxa" w:w="0"/>
+            </w:tcMar>
+            <w:vAlign w:val="center"/>
+          </w:tcPr>
+          <w:p>
+            <w:pPr>
+              <w:keepLines/>
+              <w:spacing w:after="0" w:before="0" w:line="220" w:lineRule="auto"/>
+              <w:jc w:val="center"/>
+            </w:pPr>
+            <w:r>
+              <w:rPr>
+                <w:rFonts w:ascii="Segoe UI Symbol" w:cs="Segoe UI Symbol" w:eastAsia="Segoe UI Symbol" w:hAnsi="Segoe UI Symbol"/>
                 <w:color w:val="1D4ED8"/>
-                <w:sz w:val="22"/>
-                <w:szCs w:val="22"/>
-              </w:rPr>
-              <w:t xml:space="preserve">○</w:t>
-            </w:r>
-          </w:p>
-        </w:tc>
-        <w:tc>
-          <w:tcPr>
-            <w:tcW w:type="dxa" w:w="1043"/>
-            <w:tcBorders>
-              <w:top w:val="none" w:color="auto" w:sz="0"/>
-              <w:left w:val="single" w:color="FFFFFF" w:sz="12"/>
-              <w:bottom w:val="single" w:color="D3E0DE" w:sz="4"/>
-              <w:right w:val="none" w:color="auto" w:sz="0"/>
-            </w:tcBorders>
-            <w:tcMar>
-              <w:top w:type="dxa" w:w="10"/>
-              <w:left w:type="dxa" w:w="0"/>
-              <w:bottom w:type="dxa" w:w="10"/>
-              <w:right w:type="dxa" w:w="0"/>
-            </w:tcMar>
-            <w:vAlign w:val="center"/>
-          </w:tcPr>
-          <w:p>
-            <w:pPr>
-              <w:keepLines/>
-              <w:spacing w:after="0" w:before="0" w:line="220" w:lineRule="auto"/>
-              <w:jc w:val="center"/>
-            </w:pPr>
-            <w:r>
-              <w:rPr>
-                <w:rFonts w:ascii="Calibri" w:cs="Calibri" w:eastAsia="Calibri" w:hAnsi="Calibri"/>
-                <w:b/>
-                <w:bCs/>
+                <w:sz w:val="24"/>
+                <w:szCs w:val="24"/>
+              </w:rPr>
+              <w:t xml:space="preserve">◐</w:t>
+            </w:r>
+          </w:p>
+        </w:tc>
+        <w:tc>
+          <w:tcPr>
+            <w:tcW w:type="dxa" w:w="1043"/>
+            <w:tcBorders>
+              <w:top w:val="none" w:color="auto" w:sz="0"/>
+              <w:left w:val="single" w:color="FFFFFF" w:sz="12"/>
+              <w:bottom w:val="single" w:color="D3E0DE" w:sz="4"/>
+              <w:right w:val="none" w:color="auto" w:sz="0"/>
+            </w:tcBorders>
+            <w:tcMar>
+              <w:top w:type="dxa" w:w="10"/>
+              <w:left w:type="dxa" w:w="0"/>
+              <w:bottom w:type="dxa" w:w="10"/>
+              <w:right w:type="dxa" w:w="0"/>
+            </w:tcMar>
+            <w:vAlign w:val="center"/>
+          </w:tcPr>
+          <w:p>
+            <w:pPr>
+              <w:keepLines/>
+              <w:spacing w:after="0" w:before="0" w:line="220" w:lineRule="auto"/>
+              <w:jc w:val="center"/>
+            </w:pPr>
+            <w:r>
+              <w:rPr>
+                <w:rFonts w:ascii="Segoe UI Symbol" w:cs="Segoe UI Symbol" w:eastAsia="Segoe UI Symbol" w:hAnsi="Segoe UI Symbol"/>
                 <w:color w:val="7E22CE"/>
-                <w:sz w:val="22"/>
-                <w:szCs w:val="22"/>
-              </w:rPr>
-              <w:t xml:space="preserve">○</w:t>
-            </w:r>
-          </w:p>
-        </w:tc>
-        <w:tc>
-          <w:tcPr>
-            <w:tcW w:type="dxa" w:w="1043"/>
-            <w:tcBorders>
-              <w:top w:val="none" w:color="auto" w:sz="0"/>
-              <w:left w:val="single" w:color="FFFFFF" w:sz="12"/>
-              <w:bottom w:val="single" w:color="D3E0DE" w:sz="4"/>
-              <w:right w:val="none" w:color="auto" w:sz="0"/>
-            </w:tcBorders>
-            <w:tcMar>
-              <w:top w:type="dxa" w:w="10"/>
-              <w:left w:type="dxa" w:w="0"/>
-              <w:bottom w:type="dxa" w:w="10"/>
-              <w:right w:type="dxa" w:w="0"/>
-            </w:tcMar>
-            <w:vAlign w:val="center"/>
-          </w:tcPr>
-          <w:p>
-            <w:pPr>
-              <w:keepLines/>
-              <w:spacing w:after="0" w:before="0" w:line="220" w:lineRule="auto"/>
-              <w:jc w:val="center"/>
-            </w:pPr>
-            <w:r>
-              <w:rPr>
-                <w:rFonts w:ascii="Calibri" w:cs="Calibri" w:eastAsia="Calibri" w:hAnsi="Calibri"/>
-                <w:b/>
-                <w:bCs/>
+                <w:sz w:val="24"/>
+                <w:szCs w:val="24"/>
+              </w:rPr>
+              <w:t xml:space="preserve">◐</w:t>
+            </w:r>
+          </w:p>
+        </w:tc>
+        <w:tc>
+          <w:tcPr>
+            <w:tcW w:type="dxa" w:w="1043"/>
+            <w:tcBorders>
+              <w:top w:val="none" w:color="auto" w:sz="0"/>
+              <w:left w:val="single" w:color="FFFFFF" w:sz="12"/>
+              <w:bottom w:val="single" w:color="D3E0DE" w:sz="4"/>
+              <w:right w:val="none" w:color="auto" w:sz="0"/>
+            </w:tcBorders>
+            <w:tcMar>
+              <w:top w:type="dxa" w:w="10"/>
+              <w:left w:type="dxa" w:w="0"/>
+              <w:bottom w:type="dxa" w:w="10"/>
+              <w:right w:type="dxa" w:w="0"/>
+            </w:tcMar>
+            <w:vAlign w:val="center"/>
+          </w:tcPr>
+          <w:p>
+            <w:pPr>
+              <w:keepLines/>
+              <w:spacing w:after="0" w:before="0" w:line="220" w:lineRule="auto"/>
+              <w:jc w:val="center"/>
+            </w:pPr>
+            <w:r>
+              <w:rPr>
+                <w:rFonts w:ascii="Segoe UI Symbol" w:cs="Segoe UI Symbol" w:eastAsia="Segoe UI Symbol" w:hAnsi="Segoe UI Symbol"/>
                 <w:color w:val="C2410C"/>
-                <w:sz w:val="22"/>
-                <w:szCs w:val="22"/>
-              </w:rPr>
-              <w:t xml:space="preserve">○</w:t>
-            </w:r>
-          </w:p>
-        </w:tc>
-        <w:tc>
-          <w:tcPr>
-            <w:tcW w:type="dxa" w:w="1043"/>
-            <w:tcBorders>
-              <w:top w:val="none" w:color="auto" w:sz="0"/>
-              <w:left w:val="single" w:color="FFFFFF" w:sz="12"/>
-              <w:bottom w:val="single" w:color="D3E0DE" w:sz="4"/>
-              <w:right w:val="none" w:color="auto" w:sz="0"/>
-            </w:tcBorders>
-            <w:tcMar>
-              <w:top w:type="dxa" w:w="10"/>
-              <w:left w:type="dxa" w:w="0"/>
-              <w:bottom w:type="dxa" w:w="10"/>
-              <w:right w:type="dxa" w:w="0"/>
-            </w:tcMar>
-            <w:vAlign w:val="center"/>
-          </w:tcPr>
-          <w:p>
-            <w:pPr>
-              <w:keepLines/>
-              <w:spacing w:after="0" w:before="0" w:line="220" w:lineRule="auto"/>
-              <w:jc w:val="center"/>
-            </w:pPr>
-            <w:r>
-              <w:rPr>
-                <w:rFonts w:ascii="Calibri" w:cs="Calibri" w:eastAsia="Calibri" w:hAnsi="Calibri"/>
-                <w:b/>
-                <w:bCs/>
+                <w:sz w:val="24"/>
+                <w:szCs w:val="24"/>
+              </w:rPr>
+              <w:t xml:space="preserve">◐</w:t>
+            </w:r>
+          </w:p>
+        </w:tc>
+        <w:tc>
+          <w:tcPr>
+            <w:tcW w:type="dxa" w:w="1043"/>
+            <w:tcBorders>
+              <w:top w:val="none" w:color="auto" w:sz="0"/>
+              <w:left w:val="single" w:color="FFFFFF" w:sz="12"/>
+              <w:bottom w:val="single" w:color="D3E0DE" w:sz="4"/>
+              <w:right w:val="none" w:color="auto" w:sz="0"/>
+            </w:tcBorders>
+            <w:tcMar>
+              <w:top w:type="dxa" w:w="10"/>
+              <w:left w:type="dxa" w:w="0"/>
+              <w:bottom w:type="dxa" w:w="10"/>
+              <w:right w:type="dxa" w:w="0"/>
+            </w:tcMar>
+            <w:vAlign w:val="center"/>
+          </w:tcPr>
+          <w:p>
+            <w:pPr>
+              <w:keepLines/>
+              <w:spacing w:after="0" w:before="0" w:line="220" w:lineRule="auto"/>
+              <w:jc w:val="center"/>
+            </w:pPr>
+            <w:r>
+              <w:rPr>
+                <w:rFonts w:ascii="Segoe UI Symbol" w:cs="Segoe UI Symbol" w:eastAsia="Segoe UI Symbol" w:hAnsi="Segoe UI Symbol"/>
                 <w:color w:val="BE185D"/>
-                <w:sz w:val="22"/>
-                <w:szCs w:val="22"/>
-              </w:rPr>
-              <w:t xml:space="preserve">○</w:t>
+                <w:sz w:val="24"/>
+                <w:szCs w:val="24"/>
+              </w:rPr>
+              <w:t xml:space="preserve">◐</w:t>
             </w:r>
           </w:p>
         </w:tc>
@@ -8898,7 +8866,7 @@
             </w:pPr>
             <w:r>
               <w:rPr>
-                <w:rFonts w:ascii="Calibri" w:cs="Calibri" w:eastAsia="Calibri" w:hAnsi="Calibri"/>
+                <w:rFonts w:ascii="Segoe UI Symbol" w:cs="Segoe UI Symbol" w:eastAsia="Segoe UI Symbol" w:hAnsi="Segoe UI Symbol"/>
                 <w:color w:val="A16207"/>
                 <w:sz w:val="26"/>
                 <w:szCs w:val="26"/>
@@ -8972,158 +8940,148 @@
             </w:pPr>
             <w:r>
               <w:rPr>
-                <w:rFonts w:ascii="Calibri" w:cs="Calibri" w:eastAsia="Calibri" w:hAnsi="Calibri"/>
-                <w:b/>
-                <w:bCs/>
+                <w:rFonts w:ascii="Segoe UI Symbol" w:cs="Segoe UI Symbol" w:eastAsia="Segoe UI Symbol" w:hAnsi="Segoe UI Symbol"/>
                 <w:color w:val="15803D"/>
-                <w:sz w:val="22"/>
-                <w:szCs w:val="22"/>
-              </w:rPr>
-              <w:t xml:space="preserve">○</w:t>
-            </w:r>
-          </w:p>
-        </w:tc>
-        <w:tc>
-          <w:tcPr>
-            <w:tcW w:type="dxa" w:w="1043"/>
-            <w:tcBorders>
-              <w:top w:val="none" w:color="auto" w:sz="0"/>
-              <w:left w:val="single" w:color="FFFFFF" w:sz="12"/>
-              <w:bottom w:val="single" w:color="D3E0DE" w:sz="4"/>
-              <w:right w:val="none" w:color="auto" w:sz="0"/>
-            </w:tcBorders>
-            <w:tcMar>
-              <w:top w:type="dxa" w:w="10"/>
-              <w:left w:type="dxa" w:w="0"/>
-              <w:bottom w:type="dxa" w:w="10"/>
-              <w:right w:type="dxa" w:w="0"/>
-            </w:tcMar>
-            <w:vAlign w:val="center"/>
-          </w:tcPr>
-          <w:p>
-            <w:pPr>
-              <w:keepLines/>
-              <w:spacing w:after="0" w:before="0" w:line="220" w:lineRule="auto"/>
-              <w:jc w:val="center"/>
-            </w:pPr>
-            <w:r>
-              <w:rPr>
-                <w:rFonts w:ascii="Calibri" w:cs="Calibri" w:eastAsia="Calibri" w:hAnsi="Calibri"/>
-                <w:b/>
-                <w:bCs/>
+                <w:sz w:val="24"/>
+                <w:szCs w:val="24"/>
+              </w:rPr>
+              <w:t xml:space="preserve">◐</w:t>
+            </w:r>
+          </w:p>
+        </w:tc>
+        <w:tc>
+          <w:tcPr>
+            <w:tcW w:type="dxa" w:w="1043"/>
+            <w:tcBorders>
+              <w:top w:val="none" w:color="auto" w:sz="0"/>
+              <w:left w:val="single" w:color="FFFFFF" w:sz="12"/>
+              <w:bottom w:val="single" w:color="D3E0DE" w:sz="4"/>
+              <w:right w:val="none" w:color="auto" w:sz="0"/>
+            </w:tcBorders>
+            <w:tcMar>
+              <w:top w:type="dxa" w:w="10"/>
+              <w:left w:type="dxa" w:w="0"/>
+              <w:bottom w:type="dxa" w:w="10"/>
+              <w:right w:type="dxa" w:w="0"/>
+            </w:tcMar>
+            <w:vAlign w:val="center"/>
+          </w:tcPr>
+          <w:p>
+            <w:pPr>
+              <w:keepLines/>
+              <w:spacing w:after="0" w:before="0" w:line="220" w:lineRule="auto"/>
+              <w:jc w:val="center"/>
+            </w:pPr>
+            <w:r>
+              <w:rPr>
+                <w:rFonts w:ascii="Segoe UI Symbol" w:cs="Segoe UI Symbol" w:eastAsia="Segoe UI Symbol" w:hAnsi="Segoe UI Symbol"/>
                 <w:color w:val="1D4ED8"/>
-                <w:sz w:val="22"/>
-                <w:szCs w:val="22"/>
-              </w:rPr>
-              <w:t xml:space="preserve">○</w:t>
-            </w:r>
-          </w:p>
-        </w:tc>
-        <w:tc>
-          <w:tcPr>
-            <w:tcW w:type="dxa" w:w="1043"/>
-            <w:tcBorders>
-              <w:top w:val="none" w:color="auto" w:sz="0"/>
-              <w:left w:val="single" w:color="FFFFFF" w:sz="12"/>
-              <w:bottom w:val="single" w:color="D3E0DE" w:sz="4"/>
-              <w:right w:val="none" w:color="auto" w:sz="0"/>
-            </w:tcBorders>
-            <w:tcMar>
-              <w:top w:type="dxa" w:w="10"/>
-              <w:left w:type="dxa" w:w="0"/>
-              <w:bottom w:type="dxa" w:w="10"/>
-              <w:right w:type="dxa" w:w="0"/>
-            </w:tcMar>
-            <w:vAlign w:val="center"/>
-          </w:tcPr>
-          <w:p>
-            <w:pPr>
-              <w:keepLines/>
-              <w:spacing w:after="0" w:before="0" w:line="220" w:lineRule="auto"/>
-              <w:jc w:val="center"/>
-            </w:pPr>
-            <w:r>
-              <w:rPr>
-                <w:rFonts w:ascii="Calibri" w:cs="Calibri" w:eastAsia="Calibri" w:hAnsi="Calibri"/>
-                <w:b/>
-                <w:bCs/>
+                <w:sz w:val="24"/>
+                <w:szCs w:val="24"/>
+              </w:rPr>
+              <w:t xml:space="preserve">◐</w:t>
+            </w:r>
+          </w:p>
+        </w:tc>
+        <w:tc>
+          <w:tcPr>
+            <w:tcW w:type="dxa" w:w="1043"/>
+            <w:tcBorders>
+              <w:top w:val="none" w:color="auto" w:sz="0"/>
+              <w:left w:val="single" w:color="FFFFFF" w:sz="12"/>
+              <w:bottom w:val="single" w:color="D3E0DE" w:sz="4"/>
+              <w:right w:val="none" w:color="auto" w:sz="0"/>
+            </w:tcBorders>
+            <w:tcMar>
+              <w:top w:type="dxa" w:w="10"/>
+              <w:left w:type="dxa" w:w="0"/>
+              <w:bottom w:type="dxa" w:w="10"/>
+              <w:right w:type="dxa" w:w="0"/>
+            </w:tcMar>
+            <w:vAlign w:val="center"/>
+          </w:tcPr>
+          <w:p>
+            <w:pPr>
+              <w:keepLines/>
+              <w:spacing w:after="0" w:before="0" w:line="220" w:lineRule="auto"/>
+              <w:jc w:val="center"/>
+            </w:pPr>
+            <w:r>
+              <w:rPr>
+                <w:rFonts w:ascii="Segoe UI Symbol" w:cs="Segoe UI Symbol" w:eastAsia="Segoe UI Symbol" w:hAnsi="Segoe UI Symbol"/>
                 <w:color w:val="7E22CE"/>
-                <w:sz w:val="22"/>
-                <w:szCs w:val="22"/>
-              </w:rPr>
-              <w:t xml:space="preserve">○</w:t>
-            </w:r>
-          </w:p>
-        </w:tc>
-        <w:tc>
-          <w:tcPr>
-            <w:tcW w:type="dxa" w:w="1043"/>
-            <w:tcBorders>
-              <w:top w:val="none" w:color="auto" w:sz="0"/>
-              <w:left w:val="single" w:color="FFFFFF" w:sz="12"/>
-              <w:bottom w:val="single" w:color="D3E0DE" w:sz="4"/>
-              <w:right w:val="none" w:color="auto" w:sz="0"/>
-            </w:tcBorders>
-            <w:tcMar>
-              <w:top w:type="dxa" w:w="10"/>
-              <w:left w:type="dxa" w:w="0"/>
-              <w:bottom w:type="dxa" w:w="10"/>
-              <w:right w:type="dxa" w:w="0"/>
-            </w:tcMar>
-            <w:vAlign w:val="center"/>
-          </w:tcPr>
-          <w:p>
-            <w:pPr>
-              <w:keepLines/>
-              <w:spacing w:after="0" w:before="0" w:line="220" w:lineRule="auto"/>
-              <w:jc w:val="center"/>
-            </w:pPr>
-            <w:r>
-              <w:rPr>
-                <w:rFonts w:ascii="Calibri" w:cs="Calibri" w:eastAsia="Calibri" w:hAnsi="Calibri"/>
-                <w:b/>
-                <w:bCs/>
+                <w:sz w:val="24"/>
+                <w:szCs w:val="24"/>
+              </w:rPr>
+              <w:t xml:space="preserve">◐</w:t>
+            </w:r>
+          </w:p>
+        </w:tc>
+        <w:tc>
+          <w:tcPr>
+            <w:tcW w:type="dxa" w:w="1043"/>
+            <w:tcBorders>
+              <w:top w:val="none" w:color="auto" w:sz="0"/>
+              <w:left w:val="single" w:color="FFFFFF" w:sz="12"/>
+              <w:bottom w:val="single" w:color="D3E0DE" w:sz="4"/>
+              <w:right w:val="none" w:color="auto" w:sz="0"/>
+            </w:tcBorders>
+            <w:tcMar>
+              <w:top w:type="dxa" w:w="10"/>
+              <w:left w:type="dxa" w:w="0"/>
+              <w:bottom w:type="dxa" w:w="10"/>
+              <w:right w:type="dxa" w:w="0"/>
+            </w:tcMar>
+            <w:vAlign w:val="center"/>
+          </w:tcPr>
+          <w:p>
+            <w:pPr>
+              <w:keepLines/>
+              <w:spacing w:after="0" w:before="0" w:line="220" w:lineRule="auto"/>
+              <w:jc w:val="center"/>
+            </w:pPr>
+            <w:r>
+              <w:rPr>
+                <w:rFonts w:ascii="Segoe UI Symbol" w:cs="Segoe UI Symbol" w:eastAsia="Segoe UI Symbol" w:hAnsi="Segoe UI Symbol"/>
                 <w:color w:val="C2410C"/>
-                <w:sz w:val="22"/>
-                <w:szCs w:val="22"/>
-              </w:rPr>
-              <w:t xml:space="preserve">○</w:t>
-            </w:r>
-          </w:p>
-        </w:tc>
-        <w:tc>
-          <w:tcPr>
-            <w:tcW w:type="dxa" w:w="1043"/>
-            <w:tcBorders>
-              <w:top w:val="none" w:color="auto" w:sz="0"/>
-              <w:left w:val="single" w:color="FFFFFF" w:sz="12"/>
-              <w:bottom w:val="single" w:color="D3E0DE" w:sz="4"/>
-              <w:right w:val="none" w:color="auto" w:sz="0"/>
-            </w:tcBorders>
-            <w:tcMar>
-              <w:top w:type="dxa" w:w="10"/>
-              <w:left w:type="dxa" w:w="0"/>
-              <w:bottom w:type="dxa" w:w="10"/>
-              <w:right w:type="dxa" w:w="0"/>
-            </w:tcMar>
-            <w:vAlign w:val="center"/>
-          </w:tcPr>
-          <w:p>
-            <w:pPr>
-              <w:keepLines/>
-              <w:spacing w:after="0" w:before="0" w:line="220" w:lineRule="auto"/>
-              <w:jc w:val="center"/>
-            </w:pPr>
-            <w:r>
-              <w:rPr>
-                <w:rFonts w:ascii="Calibri" w:cs="Calibri" w:eastAsia="Calibri" w:hAnsi="Calibri"/>
-                <w:b/>
-                <w:bCs/>
+                <w:sz w:val="24"/>
+                <w:szCs w:val="24"/>
+              </w:rPr>
+              <w:t xml:space="preserve">◐</w:t>
+            </w:r>
+          </w:p>
+        </w:tc>
+        <w:tc>
+          <w:tcPr>
+            <w:tcW w:type="dxa" w:w="1043"/>
+            <w:tcBorders>
+              <w:top w:val="none" w:color="auto" w:sz="0"/>
+              <w:left w:val="single" w:color="FFFFFF" w:sz="12"/>
+              <w:bottom w:val="single" w:color="D3E0DE" w:sz="4"/>
+              <w:right w:val="none" w:color="auto" w:sz="0"/>
+            </w:tcBorders>
+            <w:tcMar>
+              <w:top w:type="dxa" w:w="10"/>
+              <w:left w:type="dxa" w:w="0"/>
+              <w:bottom w:type="dxa" w:w="10"/>
+              <w:right w:type="dxa" w:w="0"/>
+            </w:tcMar>
+            <w:vAlign w:val="center"/>
+          </w:tcPr>
+          <w:p>
+            <w:pPr>
+              <w:keepLines/>
+              <w:spacing w:after="0" w:before="0" w:line="220" w:lineRule="auto"/>
+              <w:jc w:val="center"/>
+            </w:pPr>
+            <w:r>
+              <w:rPr>
+                <w:rFonts w:ascii="Segoe UI Symbol" w:cs="Segoe UI Symbol" w:eastAsia="Segoe UI Symbol" w:hAnsi="Segoe UI Symbol"/>
                 <w:color w:val="BE185D"/>
-                <w:sz w:val="22"/>
-                <w:szCs w:val="22"/>
-              </w:rPr>
-              <w:t xml:space="preserve">○</w:t>
+                <w:sz w:val="24"/>
+                <w:szCs w:val="24"/>
+              </w:rPr>
+              <w:t xml:space="preserve">◐</w:t>
             </w:r>
           </w:p>
         </w:tc>
@@ -9153,7 +9111,7 @@
             </w:pPr>
             <w:r>
               <w:rPr>
-                <w:rFonts w:ascii="Calibri" w:cs="Calibri" w:eastAsia="Calibri" w:hAnsi="Calibri"/>
+                <w:rFonts w:ascii="Segoe UI Symbol" w:cs="Segoe UI Symbol" w:eastAsia="Segoe UI Symbol" w:hAnsi="Segoe UI Symbol"/>
                 <w:color w:val="134E4A"/>
                 <w:sz w:val="26"/>
                 <w:szCs w:val="26"/>
@@ -9187,14 +9145,12 @@
             </w:pPr>
             <w:r>
               <w:rPr>
-                <w:rFonts w:ascii="Calibri" w:cs="Calibri" w:eastAsia="Calibri" w:hAnsi="Calibri"/>
-                <w:b/>
-                <w:bCs/>
+                <w:rFonts w:ascii="Segoe UI Symbol" w:cs="Segoe UI Symbol" w:eastAsia="Segoe UI Symbol" w:hAnsi="Segoe UI Symbol"/>
                 <w:color w:val="A16207"/>
-                <w:sz w:val="22"/>
-                <w:szCs w:val="22"/>
-              </w:rPr>
-              <w:t xml:space="preserve">○</w:t>
+                <w:sz w:val="24"/>
+                <w:szCs w:val="24"/>
+              </w:rPr>
+              <w:t xml:space="preserve">◐</w:t>
             </w:r>
           </w:p>
         </w:tc>
@@ -9366,7 +9322,7 @@
             </w:pPr>
             <w:r>
               <w:rPr>
-                <w:rFonts w:ascii="Calibri" w:cs="Calibri" w:eastAsia="Calibri" w:hAnsi="Calibri"/>
+                <w:rFonts w:ascii="Segoe UI Symbol" w:cs="Segoe UI Symbol" w:eastAsia="Segoe UI Symbol" w:hAnsi="Segoe UI Symbol"/>
                 <w:color w:val="C2410C"/>
                 <w:sz w:val="26"/>
                 <w:szCs w:val="26"/>
@@ -9542,194 +9498,182 @@
             </w:pPr>
             <w:r>
               <w:rPr>
-                <w:rFonts w:ascii="Calibri" w:cs="Calibri" w:eastAsia="Calibri" w:hAnsi="Calibri"/>
-                <w:b/>
-                <w:bCs/>
+                <w:rFonts w:ascii="Segoe UI Symbol" w:cs="Segoe UI Symbol" w:eastAsia="Segoe UI Symbol" w:hAnsi="Segoe UI Symbol"/>
                 <w:color w:val="15803D"/>
-                <w:sz w:val="22"/>
-                <w:szCs w:val="22"/>
-              </w:rPr>
-              <w:t xml:space="preserve">○</w:t>
-            </w:r>
-          </w:p>
-        </w:tc>
-        <w:tc>
-          <w:tcPr>
-            <w:tcW w:type="dxa" w:w="1043"/>
-            <w:tcBorders>
-              <w:top w:val="none" w:color="auto" w:sz="0"/>
-              <w:left w:val="single" w:color="FFFFFF" w:sz="12"/>
-              <w:bottom w:val="single" w:color="D3E0DE" w:sz="4"/>
-              <w:right w:val="none" w:color="auto" w:sz="0"/>
-            </w:tcBorders>
-            <w:tcMar>
-              <w:top w:type="dxa" w:w="10"/>
-              <w:left w:type="dxa" w:w="0"/>
-              <w:bottom w:type="dxa" w:w="10"/>
-              <w:right w:type="dxa" w:w="0"/>
-            </w:tcMar>
-            <w:vAlign w:val="center"/>
-          </w:tcPr>
-          <w:p>
-            <w:pPr>
-              <w:keepLines/>
-              <w:spacing w:after="0" w:before="0" w:line="220" w:lineRule="auto"/>
-              <w:jc w:val="center"/>
-            </w:pPr>
-            <w:r>
-              <w:rPr>
-                <w:rFonts w:ascii="Calibri" w:cs="Calibri" w:eastAsia="Calibri" w:hAnsi="Calibri"/>
-                <w:b/>
-                <w:bCs/>
+                <w:sz w:val="24"/>
+                <w:szCs w:val="24"/>
+              </w:rPr>
+              <w:t xml:space="preserve">◐</w:t>
+            </w:r>
+          </w:p>
+        </w:tc>
+        <w:tc>
+          <w:tcPr>
+            <w:tcW w:type="dxa" w:w="1043"/>
+            <w:tcBorders>
+              <w:top w:val="none" w:color="auto" w:sz="0"/>
+              <w:left w:val="single" w:color="FFFFFF" w:sz="12"/>
+              <w:bottom w:val="single" w:color="D3E0DE" w:sz="4"/>
+              <w:right w:val="none" w:color="auto" w:sz="0"/>
+            </w:tcBorders>
+            <w:tcMar>
+              <w:top w:type="dxa" w:w="10"/>
+              <w:left w:type="dxa" w:w="0"/>
+              <w:bottom w:type="dxa" w:w="10"/>
+              <w:right w:type="dxa" w:w="0"/>
+            </w:tcMar>
+            <w:vAlign w:val="center"/>
+          </w:tcPr>
+          <w:p>
+            <w:pPr>
+              <w:keepLines/>
+              <w:spacing w:after="0" w:before="0" w:line="220" w:lineRule="auto"/>
+              <w:jc w:val="center"/>
+            </w:pPr>
+            <w:r>
+              <w:rPr>
+                <w:rFonts w:ascii="Segoe UI Symbol" w:cs="Segoe UI Symbol" w:eastAsia="Segoe UI Symbol" w:hAnsi="Segoe UI Symbol"/>
                 <w:color w:val="1D4ED8"/>
-                <w:sz w:val="22"/>
-                <w:szCs w:val="22"/>
-              </w:rPr>
-              <w:t xml:space="preserve">○</w:t>
-            </w:r>
-          </w:p>
-        </w:tc>
-        <w:tc>
-          <w:tcPr>
-            <w:tcW w:type="dxa" w:w="1043"/>
-            <w:tcBorders>
-              <w:top w:val="none" w:color="auto" w:sz="0"/>
-              <w:left w:val="single" w:color="FFFFFF" w:sz="12"/>
-              <w:bottom w:val="single" w:color="D3E0DE" w:sz="4"/>
-              <w:right w:val="none" w:color="auto" w:sz="0"/>
-            </w:tcBorders>
-            <w:tcMar>
-              <w:top w:type="dxa" w:w="10"/>
-              <w:left w:type="dxa" w:w="0"/>
-              <w:bottom w:type="dxa" w:w="10"/>
-              <w:right w:type="dxa" w:w="0"/>
-            </w:tcMar>
-            <w:vAlign w:val="center"/>
-          </w:tcPr>
-          <w:p>
-            <w:pPr>
-              <w:keepLines/>
-              <w:spacing w:after="0" w:before="0" w:line="220" w:lineRule="auto"/>
-              <w:jc w:val="center"/>
-            </w:pPr>
-            <w:r>
-              <w:rPr>
-                <w:rFonts w:ascii="Calibri" w:cs="Calibri" w:eastAsia="Calibri" w:hAnsi="Calibri"/>
-                <w:b/>
-                <w:bCs/>
+                <w:sz w:val="24"/>
+                <w:szCs w:val="24"/>
+              </w:rPr>
+              <w:t xml:space="preserve">◐</w:t>
+            </w:r>
+          </w:p>
+        </w:tc>
+        <w:tc>
+          <w:tcPr>
+            <w:tcW w:type="dxa" w:w="1043"/>
+            <w:tcBorders>
+              <w:top w:val="none" w:color="auto" w:sz="0"/>
+              <w:left w:val="single" w:color="FFFFFF" w:sz="12"/>
+              <w:bottom w:val="single" w:color="D3E0DE" w:sz="4"/>
+              <w:right w:val="none" w:color="auto" w:sz="0"/>
+            </w:tcBorders>
+            <w:tcMar>
+              <w:top w:type="dxa" w:w="10"/>
+              <w:left w:type="dxa" w:w="0"/>
+              <w:bottom w:type="dxa" w:w="10"/>
+              <w:right w:type="dxa" w:w="0"/>
+            </w:tcMar>
+            <w:vAlign w:val="center"/>
+          </w:tcPr>
+          <w:p>
+            <w:pPr>
+              <w:keepLines/>
+              <w:spacing w:after="0" w:before="0" w:line="220" w:lineRule="auto"/>
+              <w:jc w:val="center"/>
+            </w:pPr>
+            <w:r>
+              <w:rPr>
+                <w:rFonts w:ascii="Segoe UI Symbol" w:cs="Segoe UI Symbol" w:eastAsia="Segoe UI Symbol" w:hAnsi="Segoe UI Symbol"/>
                 <w:color w:val="7E22CE"/>
-                <w:sz w:val="22"/>
-                <w:szCs w:val="22"/>
-              </w:rPr>
-              <w:t xml:space="preserve">○</w:t>
-            </w:r>
-          </w:p>
-        </w:tc>
-        <w:tc>
-          <w:tcPr>
-            <w:tcW w:type="dxa" w:w="1043"/>
-            <w:tcBorders>
-              <w:top w:val="none" w:color="auto" w:sz="0"/>
-              <w:left w:val="single" w:color="FFFFFF" w:sz="12"/>
-              <w:bottom w:val="single" w:color="D3E0DE" w:sz="4"/>
-              <w:right w:val="none" w:color="auto" w:sz="0"/>
-            </w:tcBorders>
-            <w:tcMar>
-              <w:top w:type="dxa" w:w="10"/>
-              <w:left w:type="dxa" w:w="0"/>
-              <w:bottom w:type="dxa" w:w="10"/>
-              <w:right w:type="dxa" w:w="0"/>
-            </w:tcMar>
-            <w:vAlign w:val="center"/>
-          </w:tcPr>
-          <w:p>
-            <w:pPr>
-              <w:keepLines/>
-              <w:spacing w:after="0" w:before="0" w:line="220" w:lineRule="auto"/>
-              <w:jc w:val="center"/>
-            </w:pPr>
-            <w:r>
-              <w:rPr>
-                <w:rFonts w:ascii="Calibri" w:cs="Calibri" w:eastAsia="Calibri" w:hAnsi="Calibri"/>
-                <w:b/>
-                <w:bCs/>
+                <w:sz w:val="24"/>
+                <w:szCs w:val="24"/>
+              </w:rPr>
+              <w:t xml:space="preserve">◐</w:t>
+            </w:r>
+          </w:p>
+        </w:tc>
+        <w:tc>
+          <w:tcPr>
+            <w:tcW w:type="dxa" w:w="1043"/>
+            <w:tcBorders>
+              <w:top w:val="none" w:color="auto" w:sz="0"/>
+              <w:left w:val="single" w:color="FFFFFF" w:sz="12"/>
+              <w:bottom w:val="single" w:color="D3E0DE" w:sz="4"/>
+              <w:right w:val="none" w:color="auto" w:sz="0"/>
+            </w:tcBorders>
+            <w:tcMar>
+              <w:top w:type="dxa" w:w="10"/>
+              <w:left w:type="dxa" w:w="0"/>
+              <w:bottom w:type="dxa" w:w="10"/>
+              <w:right w:type="dxa" w:w="0"/>
+            </w:tcMar>
+            <w:vAlign w:val="center"/>
+          </w:tcPr>
+          <w:p>
+            <w:pPr>
+              <w:keepLines/>
+              <w:spacing w:after="0" w:before="0" w:line="220" w:lineRule="auto"/>
+              <w:jc w:val="center"/>
+            </w:pPr>
+            <w:r>
+              <w:rPr>
+                <w:rFonts w:ascii="Segoe UI Symbol" w:cs="Segoe UI Symbol" w:eastAsia="Segoe UI Symbol" w:hAnsi="Segoe UI Symbol"/>
                 <w:color w:val="C2410C"/>
-                <w:sz w:val="22"/>
-                <w:szCs w:val="22"/>
-              </w:rPr>
-              <w:t xml:space="preserve">○</w:t>
-            </w:r>
-          </w:p>
-        </w:tc>
-        <w:tc>
-          <w:tcPr>
-            <w:tcW w:type="dxa" w:w="1043"/>
-            <w:tcBorders>
-              <w:top w:val="none" w:color="auto" w:sz="0"/>
-              <w:left w:val="single" w:color="FFFFFF" w:sz="12"/>
-              <w:bottom w:val="single" w:color="D3E0DE" w:sz="4"/>
-              <w:right w:val="none" w:color="auto" w:sz="0"/>
-            </w:tcBorders>
-            <w:tcMar>
-              <w:top w:type="dxa" w:w="10"/>
-              <w:left w:type="dxa" w:w="0"/>
-              <w:bottom w:type="dxa" w:w="10"/>
-              <w:right w:type="dxa" w:w="0"/>
-            </w:tcMar>
-            <w:vAlign w:val="center"/>
-          </w:tcPr>
-          <w:p>
-            <w:pPr>
-              <w:keepLines/>
-              <w:spacing w:after="0" w:before="0" w:line="220" w:lineRule="auto"/>
-              <w:jc w:val="center"/>
-            </w:pPr>
-            <w:r>
-              <w:rPr>
-                <w:rFonts w:ascii="Calibri" w:cs="Calibri" w:eastAsia="Calibri" w:hAnsi="Calibri"/>
-                <w:b/>
-                <w:bCs/>
+                <w:sz w:val="24"/>
+                <w:szCs w:val="24"/>
+              </w:rPr>
+              <w:t xml:space="preserve">◐</w:t>
+            </w:r>
+          </w:p>
+        </w:tc>
+        <w:tc>
+          <w:tcPr>
+            <w:tcW w:type="dxa" w:w="1043"/>
+            <w:tcBorders>
+              <w:top w:val="none" w:color="auto" w:sz="0"/>
+              <w:left w:val="single" w:color="FFFFFF" w:sz="12"/>
+              <w:bottom w:val="single" w:color="D3E0DE" w:sz="4"/>
+              <w:right w:val="none" w:color="auto" w:sz="0"/>
+            </w:tcBorders>
+            <w:tcMar>
+              <w:top w:type="dxa" w:w="10"/>
+              <w:left w:type="dxa" w:w="0"/>
+              <w:bottom w:type="dxa" w:w="10"/>
+              <w:right w:type="dxa" w:w="0"/>
+            </w:tcMar>
+            <w:vAlign w:val="center"/>
+          </w:tcPr>
+          <w:p>
+            <w:pPr>
+              <w:keepLines/>
+              <w:spacing w:after="0" w:before="0" w:line="220" w:lineRule="auto"/>
+              <w:jc w:val="center"/>
+            </w:pPr>
+            <w:r>
+              <w:rPr>
+                <w:rFonts w:ascii="Segoe UI Symbol" w:cs="Segoe UI Symbol" w:eastAsia="Segoe UI Symbol" w:hAnsi="Segoe UI Symbol"/>
                 <w:color w:val="BE185D"/>
-                <w:sz w:val="22"/>
-                <w:szCs w:val="22"/>
-              </w:rPr>
-              <w:t xml:space="preserve">○</w:t>
-            </w:r>
-          </w:p>
-        </w:tc>
-        <w:tc>
-          <w:tcPr>
-            <w:tcW w:type="dxa" w:w="1043"/>
-            <w:tcBorders>
-              <w:top w:val="none" w:color="auto" w:sz="0"/>
-              <w:left w:val="single" w:color="FFFFFF" w:sz="12"/>
-              <w:bottom w:val="single" w:color="D3E0DE" w:sz="4"/>
-              <w:right w:val="none" w:color="auto" w:sz="0"/>
-            </w:tcBorders>
-            <w:tcMar>
-              <w:top w:type="dxa" w:w="10"/>
-              <w:left w:type="dxa" w:w="0"/>
-              <w:bottom w:type="dxa" w:w="10"/>
-              <w:right w:type="dxa" w:w="0"/>
-            </w:tcMar>
-            <w:vAlign w:val="center"/>
-          </w:tcPr>
-          <w:p>
-            <w:pPr>
-              <w:keepLines/>
-              <w:spacing w:after="0" w:before="0" w:line="220" w:lineRule="auto"/>
-              <w:jc w:val="center"/>
-            </w:pPr>
-            <w:r>
-              <w:rPr>
-                <w:rFonts w:ascii="Calibri" w:cs="Calibri" w:eastAsia="Calibri" w:hAnsi="Calibri"/>
-                <w:b/>
-                <w:bCs/>
+                <w:sz w:val="24"/>
+                <w:szCs w:val="24"/>
+              </w:rPr>
+              <w:t xml:space="preserve">◐</w:t>
+            </w:r>
+          </w:p>
+        </w:tc>
+        <w:tc>
+          <w:tcPr>
+            <w:tcW w:type="dxa" w:w="1043"/>
+            <w:tcBorders>
+              <w:top w:val="none" w:color="auto" w:sz="0"/>
+              <w:left w:val="single" w:color="FFFFFF" w:sz="12"/>
+              <w:bottom w:val="single" w:color="D3E0DE" w:sz="4"/>
+              <w:right w:val="none" w:color="auto" w:sz="0"/>
+            </w:tcBorders>
+            <w:tcMar>
+              <w:top w:type="dxa" w:w="10"/>
+              <w:left w:type="dxa" w:w="0"/>
+              <w:bottom w:type="dxa" w:w="10"/>
+              <w:right w:type="dxa" w:w="0"/>
+            </w:tcMar>
+            <w:vAlign w:val="center"/>
+          </w:tcPr>
+          <w:p>
+            <w:pPr>
+              <w:keepLines/>
+              <w:spacing w:after="0" w:before="0" w:line="220" w:lineRule="auto"/>
+              <w:jc w:val="center"/>
+            </w:pPr>
+            <w:r>
+              <w:rPr>
+                <w:rFonts w:ascii="Segoe UI Symbol" w:cs="Segoe UI Symbol" w:eastAsia="Segoe UI Symbol" w:hAnsi="Segoe UI Symbol"/>
                 <w:color w:val="134E4A"/>
-                <w:sz w:val="22"/>
-                <w:szCs w:val="22"/>
-              </w:rPr>
-              <w:t xml:space="preserve">○</w:t>
+                <w:sz w:val="24"/>
+                <w:szCs w:val="24"/>
+              </w:rPr>
+              <w:t xml:space="preserve">◐</w:t>
             </w:r>
           </w:p>
         </w:tc>
@@ -9759,7 +9703,7 @@
             </w:pPr>
             <w:r>
               <w:rPr>
-                <w:rFonts w:ascii="Calibri" w:cs="Calibri" w:eastAsia="Calibri" w:hAnsi="Calibri"/>
+                <w:rFonts w:ascii="Segoe UI Symbol" w:cs="Segoe UI Symbol" w:eastAsia="Segoe UI Symbol" w:hAnsi="Segoe UI Symbol"/>
                 <w:color w:val="A16207"/>
                 <w:sz w:val="26"/>
                 <w:szCs w:val="26"/>
@@ -9833,86 +9777,80 @@
             </w:pPr>
             <w:r>
               <w:rPr>
-                <w:rFonts w:ascii="Calibri" w:cs="Calibri" w:eastAsia="Calibri" w:hAnsi="Calibri"/>
-                <w:b/>
-                <w:bCs/>
+                <w:rFonts w:ascii="Segoe UI Symbol" w:cs="Segoe UI Symbol" w:eastAsia="Segoe UI Symbol" w:hAnsi="Segoe UI Symbol"/>
                 <w:color w:val="15803D"/>
-                <w:sz w:val="22"/>
-                <w:szCs w:val="22"/>
-              </w:rPr>
-              <w:t xml:space="preserve">○</w:t>
-            </w:r>
-          </w:p>
-        </w:tc>
-        <w:tc>
-          <w:tcPr>
-            <w:tcW w:type="dxa" w:w="1043"/>
-            <w:tcBorders>
-              <w:top w:val="none" w:color="auto" w:sz="0"/>
-              <w:left w:val="single" w:color="FFFFFF" w:sz="12"/>
-              <w:bottom w:val="single" w:color="D3E0DE" w:sz="4"/>
-              <w:right w:val="none" w:color="auto" w:sz="0"/>
-            </w:tcBorders>
-            <w:tcMar>
-              <w:top w:type="dxa" w:w="10"/>
-              <w:left w:type="dxa" w:w="0"/>
-              <w:bottom w:type="dxa" w:w="10"/>
-              <w:right w:type="dxa" w:w="0"/>
-            </w:tcMar>
-            <w:vAlign w:val="center"/>
-          </w:tcPr>
-          <w:p>
-            <w:pPr>
-              <w:keepLines/>
-              <w:spacing w:after="0" w:before="0" w:line="220" w:lineRule="auto"/>
-              <w:jc w:val="center"/>
-            </w:pPr>
-            <w:r>
-              <w:rPr>
-                <w:rFonts w:ascii="Calibri" w:cs="Calibri" w:eastAsia="Calibri" w:hAnsi="Calibri"/>
-                <w:b/>
-                <w:bCs/>
+                <w:sz w:val="24"/>
+                <w:szCs w:val="24"/>
+              </w:rPr>
+              <w:t xml:space="preserve">◐</w:t>
+            </w:r>
+          </w:p>
+        </w:tc>
+        <w:tc>
+          <w:tcPr>
+            <w:tcW w:type="dxa" w:w="1043"/>
+            <w:tcBorders>
+              <w:top w:val="none" w:color="auto" w:sz="0"/>
+              <w:left w:val="single" w:color="FFFFFF" w:sz="12"/>
+              <w:bottom w:val="single" w:color="D3E0DE" w:sz="4"/>
+              <w:right w:val="none" w:color="auto" w:sz="0"/>
+            </w:tcBorders>
+            <w:tcMar>
+              <w:top w:type="dxa" w:w="10"/>
+              <w:left w:type="dxa" w:w="0"/>
+              <w:bottom w:type="dxa" w:w="10"/>
+              <w:right w:type="dxa" w:w="0"/>
+            </w:tcMar>
+            <w:vAlign w:val="center"/>
+          </w:tcPr>
+          <w:p>
+            <w:pPr>
+              <w:keepLines/>
+              <w:spacing w:after="0" w:before="0" w:line="220" w:lineRule="auto"/>
+              <w:jc w:val="center"/>
+            </w:pPr>
+            <w:r>
+              <w:rPr>
+                <w:rFonts w:ascii="Segoe UI Symbol" w:cs="Segoe UI Symbol" w:eastAsia="Segoe UI Symbol" w:hAnsi="Segoe UI Symbol"/>
                 <w:color w:val="1D4ED8"/>
-                <w:sz w:val="22"/>
-                <w:szCs w:val="22"/>
-              </w:rPr>
-              <w:t xml:space="preserve">○</w:t>
-            </w:r>
-          </w:p>
-        </w:tc>
-        <w:tc>
-          <w:tcPr>
-            <w:tcW w:type="dxa" w:w="1043"/>
-            <w:tcBorders>
-              <w:top w:val="none" w:color="auto" w:sz="0"/>
-              <w:left w:val="single" w:color="FFFFFF" w:sz="12"/>
-              <w:bottom w:val="single" w:color="D3E0DE" w:sz="4"/>
-              <w:right w:val="none" w:color="auto" w:sz="0"/>
-            </w:tcBorders>
-            <w:tcMar>
-              <w:top w:type="dxa" w:w="10"/>
-              <w:left w:type="dxa" w:w="0"/>
-              <w:bottom w:type="dxa" w:w="10"/>
-              <w:right w:type="dxa" w:w="0"/>
-            </w:tcMar>
-            <w:vAlign w:val="center"/>
-          </w:tcPr>
-          <w:p>
-            <w:pPr>
-              <w:keepLines/>
-              <w:spacing w:after="0" w:before="0" w:line="220" w:lineRule="auto"/>
-              <w:jc w:val="center"/>
-            </w:pPr>
-            <w:r>
-              <w:rPr>
-                <w:rFonts w:ascii="Calibri" w:cs="Calibri" w:eastAsia="Calibri" w:hAnsi="Calibri"/>
-                <w:b/>
-                <w:bCs/>
+                <w:sz w:val="24"/>
+                <w:szCs w:val="24"/>
+              </w:rPr>
+              <w:t xml:space="preserve">◐</w:t>
+            </w:r>
+          </w:p>
+        </w:tc>
+        <w:tc>
+          <w:tcPr>
+            <w:tcW w:type="dxa" w:w="1043"/>
+            <w:tcBorders>
+              <w:top w:val="none" w:color="auto" w:sz="0"/>
+              <w:left w:val="single" w:color="FFFFFF" w:sz="12"/>
+              <w:bottom w:val="single" w:color="D3E0DE" w:sz="4"/>
+              <w:right w:val="none" w:color="auto" w:sz="0"/>
+            </w:tcBorders>
+            <w:tcMar>
+              <w:top w:type="dxa" w:w="10"/>
+              <w:left w:type="dxa" w:w="0"/>
+              <w:bottom w:type="dxa" w:w="10"/>
+              <w:right w:type="dxa" w:w="0"/>
+            </w:tcMar>
+            <w:vAlign w:val="center"/>
+          </w:tcPr>
+          <w:p>
+            <w:pPr>
+              <w:keepLines/>
+              <w:spacing w:after="0" w:before="0" w:line="220" w:lineRule="auto"/>
+              <w:jc w:val="center"/>
+            </w:pPr>
+            <w:r>
+              <w:rPr>
+                <w:rFonts w:ascii="Segoe UI Symbol" w:cs="Segoe UI Symbol" w:eastAsia="Segoe UI Symbol" w:hAnsi="Segoe UI Symbol"/>
                 <w:color w:val="7E22CE"/>
-                <w:sz w:val="22"/>
-                <w:szCs w:val="22"/>
-              </w:rPr>
-              <w:t xml:space="preserve">○</w:t>
+                <w:sz w:val="24"/>
+                <w:szCs w:val="24"/>
+              </w:rPr>
+              <w:t xml:space="preserve">◐</w:t>
             </w:r>
           </w:p>
         </w:tc>
@@ -9942,7 +9880,7 @@
             </w:pPr>
             <w:r>
               <w:rPr>
-                <w:rFonts w:ascii="Calibri" w:cs="Calibri" w:eastAsia="Calibri" w:hAnsi="Calibri"/>
+                <w:rFonts w:ascii="Segoe UI Symbol" w:cs="Segoe UI Symbol" w:eastAsia="Segoe UI Symbol" w:hAnsi="Segoe UI Symbol"/>
                 <w:color w:val="C2410C"/>
                 <w:sz w:val="26"/>
                 <w:szCs w:val="26"/>
@@ -9976,14 +9914,12 @@
             </w:pPr>
             <w:r>
               <w:rPr>
-                <w:rFonts w:ascii="Calibri" w:cs="Calibri" w:eastAsia="Calibri" w:hAnsi="Calibri"/>
-                <w:b/>
-                <w:bCs/>
+                <w:rFonts w:ascii="Segoe UI Symbol" w:cs="Segoe UI Symbol" w:eastAsia="Segoe UI Symbol" w:hAnsi="Segoe UI Symbol"/>
                 <w:color w:val="BE185D"/>
-                <w:sz w:val="22"/>
-                <w:szCs w:val="22"/>
-              </w:rPr>
-              <w:t xml:space="preserve">○</w:t>
+                <w:sz w:val="24"/>
+                <w:szCs w:val="24"/>
+              </w:rPr>
+              <w:t xml:space="preserve">◐</w:t>
             </w:r>
           </w:p>
         </w:tc>
@@ -10121,7 +10057,7 @@
             </w:pPr>
             <w:r>
               <w:rPr>
-                <w:rFonts w:ascii="Calibri" w:cs="Calibri" w:eastAsia="Calibri" w:hAnsi="Calibri"/>
+                <w:rFonts w:ascii="Segoe UI Symbol" w:cs="Segoe UI Symbol" w:eastAsia="Segoe UI Symbol" w:hAnsi="Segoe UI Symbol"/>
                 <w:color w:val="15803D"/>
                 <w:sz w:val="26"/>
                 <w:szCs w:val="26"/>
@@ -10399,14 +10335,12 @@
             </w:pPr>
             <w:r>
               <w:rPr>
-                <w:rFonts w:ascii="Calibri" w:cs="Calibri" w:eastAsia="Calibri" w:hAnsi="Calibri"/>
-                <w:b/>
-                <w:bCs/>
+                <w:rFonts w:ascii="Segoe UI Symbol" w:cs="Segoe UI Symbol" w:eastAsia="Segoe UI Symbol" w:hAnsi="Segoe UI Symbol"/>
                 <w:color w:val="15803D"/>
-                <w:sz w:val="22"/>
-                <w:szCs w:val="22"/>
-              </w:rPr>
-              <w:t xml:space="preserve">○</w:t>
+                <w:sz w:val="24"/>
+                <w:szCs w:val="24"/>
+              </w:rPr>
+              <w:t xml:space="preserve">◐</w:t>
             </w:r>
           </w:p>
         </w:tc>
@@ -10470,7 +10404,7 @@
             </w:pPr>
             <w:r>
               <w:rPr>
-                <w:rFonts w:ascii="Calibri" w:cs="Calibri" w:eastAsia="Calibri" w:hAnsi="Calibri"/>
+                <w:rFonts w:ascii="Segoe UI Symbol" w:cs="Segoe UI Symbol" w:eastAsia="Segoe UI Symbol" w:hAnsi="Segoe UI Symbol"/>
                 <w:color w:val="7E22CE"/>
                 <w:sz w:val="26"/>
                 <w:szCs w:val="26"/>
@@ -10504,50 +10438,46 @@
             </w:pPr>
             <w:r>
               <w:rPr>
-                <w:rFonts w:ascii="Calibri" w:cs="Calibri" w:eastAsia="Calibri" w:hAnsi="Calibri"/>
-                <w:b/>
-                <w:bCs/>
+                <w:rFonts w:ascii="Segoe UI Symbol" w:cs="Segoe UI Symbol" w:eastAsia="Segoe UI Symbol" w:hAnsi="Segoe UI Symbol"/>
                 <w:color w:val="C2410C"/>
-                <w:sz w:val="22"/>
-                <w:szCs w:val="22"/>
-              </w:rPr>
-              <w:t xml:space="preserve">○</w:t>
-            </w:r>
-          </w:p>
-        </w:tc>
-        <w:tc>
-          <w:tcPr>
-            <w:tcW w:type="dxa" w:w="1043"/>
-            <w:tcBorders>
-              <w:top w:val="none" w:color="auto" w:sz="0"/>
-              <w:left w:val="single" w:color="FFFFFF" w:sz="12"/>
-              <w:bottom w:val="single" w:color="D3E0DE" w:sz="4"/>
-              <w:right w:val="none" w:color="auto" w:sz="0"/>
-            </w:tcBorders>
-            <w:tcMar>
-              <w:top w:type="dxa" w:w="10"/>
-              <w:left w:type="dxa" w:w="0"/>
-              <w:bottom w:type="dxa" w:w="10"/>
-              <w:right w:type="dxa" w:w="0"/>
-            </w:tcMar>
-            <w:vAlign w:val="center"/>
-          </w:tcPr>
-          <w:p>
-            <w:pPr>
-              <w:keepLines/>
-              <w:spacing w:after="0" w:before="0" w:line="220" w:lineRule="auto"/>
-              <w:jc w:val="center"/>
-            </w:pPr>
-            <w:r>
-              <w:rPr>
-                <w:rFonts w:ascii="Calibri" w:cs="Calibri" w:eastAsia="Calibri" w:hAnsi="Calibri"/>
-                <w:b/>
-                <w:bCs/>
+                <w:sz w:val="24"/>
+                <w:szCs w:val="24"/>
+              </w:rPr>
+              <w:t xml:space="preserve">◐</w:t>
+            </w:r>
+          </w:p>
+        </w:tc>
+        <w:tc>
+          <w:tcPr>
+            <w:tcW w:type="dxa" w:w="1043"/>
+            <w:tcBorders>
+              <w:top w:val="none" w:color="auto" w:sz="0"/>
+              <w:left w:val="single" w:color="FFFFFF" w:sz="12"/>
+              <w:bottom w:val="single" w:color="D3E0DE" w:sz="4"/>
+              <w:right w:val="none" w:color="auto" w:sz="0"/>
+            </w:tcBorders>
+            <w:tcMar>
+              <w:top w:type="dxa" w:w="10"/>
+              <w:left w:type="dxa" w:w="0"/>
+              <w:bottom w:type="dxa" w:w="10"/>
+              <w:right w:type="dxa" w:w="0"/>
+            </w:tcMar>
+            <w:vAlign w:val="center"/>
+          </w:tcPr>
+          <w:p>
+            <w:pPr>
+              <w:keepLines/>
+              <w:spacing w:after="0" w:before="0" w:line="220" w:lineRule="auto"/>
+              <w:jc w:val="center"/>
+            </w:pPr>
+            <w:r>
+              <w:rPr>
+                <w:rFonts w:ascii="Segoe UI Symbol" w:cs="Segoe UI Symbol" w:eastAsia="Segoe UI Symbol" w:hAnsi="Segoe UI Symbol"/>
                 <w:color w:val="BE185D"/>
-                <w:sz w:val="22"/>
-                <w:szCs w:val="22"/>
-              </w:rPr>
-              <w:t xml:space="preserve">○</w:t>
+                <w:sz w:val="24"/>
+                <w:szCs w:val="24"/>
+              </w:rPr>
+              <w:t xml:space="preserve">◐</w:t>
             </w:r>
           </w:p>
         </w:tc>
@@ -10577,7 +10507,7 @@
             </w:pPr>
             <w:r>
               <w:rPr>
-                <w:rFonts w:ascii="Calibri" w:cs="Calibri" w:eastAsia="Calibri" w:hAnsi="Calibri"/>
+                <w:rFonts w:ascii="Segoe UI Symbol" w:cs="Segoe UI Symbol" w:eastAsia="Segoe UI Symbol" w:hAnsi="Segoe UI Symbol"/>
                 <w:color w:val="134E4A"/>
                 <w:sz w:val="26"/>
                 <w:szCs w:val="26"/>
@@ -10685,50 +10615,46 @@
             </w:pPr>
             <w:r>
               <w:rPr>
-                <w:rFonts w:ascii="Calibri" w:cs="Calibri" w:eastAsia="Calibri" w:hAnsi="Calibri"/>
-                <w:b/>
-                <w:bCs/>
+                <w:rFonts w:ascii="Segoe UI Symbol" w:cs="Segoe UI Symbol" w:eastAsia="Segoe UI Symbol" w:hAnsi="Segoe UI Symbol"/>
                 <w:color w:val="15803D"/>
-                <w:sz w:val="22"/>
-                <w:szCs w:val="22"/>
-              </w:rPr>
-              <w:t xml:space="preserve">○</w:t>
-            </w:r>
-          </w:p>
-        </w:tc>
-        <w:tc>
-          <w:tcPr>
-            <w:tcW w:type="dxa" w:w="1043"/>
-            <w:tcBorders>
-              <w:top w:val="none" w:color="auto" w:sz="0"/>
-              <w:left w:val="single" w:color="FFFFFF" w:sz="12"/>
-              <w:bottom w:val="single" w:color="D3E0DE" w:sz="4"/>
-              <w:right w:val="none" w:color="auto" w:sz="0"/>
-            </w:tcBorders>
-            <w:tcMar>
-              <w:top w:type="dxa" w:w="10"/>
-              <w:left w:type="dxa" w:w="0"/>
-              <w:bottom w:type="dxa" w:w="10"/>
-              <w:right w:type="dxa" w:w="0"/>
-            </w:tcMar>
-            <w:vAlign w:val="center"/>
-          </w:tcPr>
-          <w:p>
-            <w:pPr>
-              <w:keepLines/>
-              <w:spacing w:after="0" w:before="0" w:line="220" w:lineRule="auto"/>
-              <w:jc w:val="center"/>
-            </w:pPr>
-            <w:r>
-              <w:rPr>
-                <w:rFonts w:ascii="Calibri" w:cs="Calibri" w:eastAsia="Calibri" w:hAnsi="Calibri"/>
-                <w:b/>
-                <w:bCs/>
+                <w:sz w:val="24"/>
+                <w:szCs w:val="24"/>
+              </w:rPr>
+              <w:t xml:space="preserve">◐</w:t>
+            </w:r>
+          </w:p>
+        </w:tc>
+        <w:tc>
+          <w:tcPr>
+            <w:tcW w:type="dxa" w:w="1043"/>
+            <w:tcBorders>
+              <w:top w:val="none" w:color="auto" w:sz="0"/>
+              <w:left w:val="single" w:color="FFFFFF" w:sz="12"/>
+              <w:bottom w:val="single" w:color="D3E0DE" w:sz="4"/>
+              <w:right w:val="none" w:color="auto" w:sz="0"/>
+            </w:tcBorders>
+            <w:tcMar>
+              <w:top w:type="dxa" w:w="10"/>
+              <w:left w:type="dxa" w:w="0"/>
+              <w:bottom w:type="dxa" w:w="10"/>
+              <w:right w:type="dxa" w:w="0"/>
+            </w:tcMar>
+            <w:vAlign w:val="center"/>
+          </w:tcPr>
+          <w:p>
+            <w:pPr>
+              <w:keepLines/>
+              <w:spacing w:after="0" w:before="0" w:line="220" w:lineRule="auto"/>
+              <w:jc w:val="center"/>
+            </w:pPr>
+            <w:r>
+              <w:rPr>
+                <w:rFonts w:ascii="Segoe UI Symbol" w:cs="Segoe UI Symbol" w:eastAsia="Segoe UI Symbol" w:hAnsi="Segoe UI Symbol"/>
                 <w:color w:val="1D4ED8"/>
-                <w:sz w:val="22"/>
-                <w:szCs w:val="22"/>
-              </w:rPr>
-              <w:t xml:space="preserve">○</w:t>
+                <w:sz w:val="24"/>
+                <w:szCs w:val="24"/>
+              </w:rPr>
+              <w:t xml:space="preserve">◐</w:t>
             </w:r>
           </w:p>
         </w:tc>
@@ -10758,7 +10684,7 @@
             </w:pPr>
             <w:r>
               <w:rPr>
-                <w:rFonts w:ascii="Calibri" w:cs="Calibri" w:eastAsia="Calibri" w:hAnsi="Calibri"/>
+                <w:rFonts w:ascii="Segoe UI Symbol" w:cs="Segoe UI Symbol" w:eastAsia="Segoe UI Symbol" w:hAnsi="Segoe UI Symbol"/>
                 <w:color w:val="7E22CE"/>
                 <w:sz w:val="26"/>
                 <w:szCs w:val="26"/>
@@ -10792,50 +10718,46 @@
             </w:pPr>
             <w:r>
               <w:rPr>
-                <w:rFonts w:ascii="Calibri" w:cs="Calibri" w:eastAsia="Calibri" w:hAnsi="Calibri"/>
-                <w:b/>
-                <w:bCs/>
+                <w:rFonts w:ascii="Segoe UI Symbol" w:cs="Segoe UI Symbol" w:eastAsia="Segoe UI Symbol" w:hAnsi="Segoe UI Symbol"/>
                 <w:color w:val="C2410C"/>
-                <w:sz w:val="22"/>
-                <w:szCs w:val="22"/>
-              </w:rPr>
-              <w:t xml:space="preserve">○</w:t>
-            </w:r>
-          </w:p>
-        </w:tc>
-        <w:tc>
-          <w:tcPr>
-            <w:tcW w:type="dxa" w:w="1043"/>
-            <w:tcBorders>
-              <w:top w:val="none" w:color="auto" w:sz="0"/>
-              <w:left w:val="single" w:color="FFFFFF" w:sz="12"/>
-              <w:bottom w:val="single" w:color="D3E0DE" w:sz="4"/>
-              <w:right w:val="none" w:color="auto" w:sz="0"/>
-            </w:tcBorders>
-            <w:tcMar>
-              <w:top w:type="dxa" w:w="10"/>
-              <w:left w:type="dxa" w:w="0"/>
-              <w:bottom w:type="dxa" w:w="10"/>
-              <w:right w:type="dxa" w:w="0"/>
-            </w:tcMar>
-            <w:vAlign w:val="center"/>
-          </w:tcPr>
-          <w:p>
-            <w:pPr>
-              <w:keepLines/>
-              <w:spacing w:after="0" w:before="0" w:line="220" w:lineRule="auto"/>
-              <w:jc w:val="center"/>
-            </w:pPr>
-            <w:r>
-              <w:rPr>
-                <w:rFonts w:ascii="Calibri" w:cs="Calibri" w:eastAsia="Calibri" w:hAnsi="Calibri"/>
-                <w:b/>
-                <w:bCs/>
+                <w:sz w:val="24"/>
+                <w:szCs w:val="24"/>
+              </w:rPr>
+              <w:t xml:space="preserve">◐</w:t>
+            </w:r>
+          </w:p>
+        </w:tc>
+        <w:tc>
+          <w:tcPr>
+            <w:tcW w:type="dxa" w:w="1043"/>
+            <w:tcBorders>
+              <w:top w:val="none" w:color="auto" w:sz="0"/>
+              <w:left w:val="single" w:color="FFFFFF" w:sz="12"/>
+              <w:bottom w:val="single" w:color="D3E0DE" w:sz="4"/>
+              <w:right w:val="none" w:color="auto" w:sz="0"/>
+            </w:tcBorders>
+            <w:tcMar>
+              <w:top w:type="dxa" w:w="10"/>
+              <w:left w:type="dxa" w:w="0"/>
+              <w:bottom w:type="dxa" w:w="10"/>
+              <w:right w:type="dxa" w:w="0"/>
+            </w:tcMar>
+            <w:vAlign w:val="center"/>
+          </w:tcPr>
+          <w:p>
+            <w:pPr>
+              <w:keepLines/>
+              <w:spacing w:after="0" w:before="0" w:line="220" w:lineRule="auto"/>
+              <w:jc w:val="center"/>
+            </w:pPr>
+            <w:r>
+              <w:rPr>
+                <w:rFonts w:ascii="Segoe UI Symbol" w:cs="Segoe UI Symbol" w:eastAsia="Segoe UI Symbol" w:hAnsi="Segoe UI Symbol"/>
                 <w:color w:val="BE185D"/>
-                <w:sz w:val="22"/>
-                <w:szCs w:val="22"/>
-              </w:rPr>
-              <w:t xml:space="preserve">○</w:t>
+                <w:sz w:val="24"/>
+                <w:szCs w:val="24"/>
+              </w:rPr>
+              <w:t xml:space="preserve">◐</w:t>
             </w:r>
           </w:p>
         </w:tc>
@@ -10865,7 +10787,7 @@
             </w:pPr>
             <w:r>
               <w:rPr>
-                <w:rFonts w:ascii="Calibri" w:cs="Calibri" w:eastAsia="Calibri" w:hAnsi="Calibri"/>
+                <w:rFonts w:ascii="Segoe UI Symbol" w:cs="Segoe UI Symbol" w:eastAsia="Segoe UI Symbol" w:hAnsi="Segoe UI Symbol"/>
                 <w:color w:val="134E4A"/>
                 <w:sz w:val="26"/>
                 <w:szCs w:val="26"/>
@@ -10917,7 +10839,7 @@
       </w:pPr>
       <w:r>
         <w:rPr>
-          <w:rFonts w:ascii="Calibri" w:cs="Calibri" w:eastAsia="Calibri" w:hAnsi="Calibri"/>
+          <w:rFonts w:ascii="Segoe UI Symbol" w:cs="Segoe UI Symbol" w:eastAsia="Segoe UI Symbol" w:hAnsi="Segoe UI Symbol"/>
           <w:color w:val="134E4A"/>
           <w:sz w:val="26"/>
           <w:szCs w:val="26"/>
@@ -10931,7 +10853,7 @@
           <w:sz w:val="18"/>
           <w:szCs w:val="18"/>
         </w:rPr>
-        <w:t xml:space="preserve">  Référent de la mission (case colorée)</w:t>
+        <w:t xml:space="preserve">  Lune pleine : référent de la mission (case colorée)</w:t>
       </w:r>
       <w:r>
         <w:rPr>
@@ -10944,14 +10866,12 @@
       </w:r>
       <w:r>
         <w:rPr>
-          <w:rFonts w:ascii="Calibri" w:cs="Calibri" w:eastAsia="Calibri" w:hAnsi="Calibri"/>
-          <w:b/>
-          <w:bCs/>
+          <w:rFonts w:ascii="Segoe UI Symbol" w:cs="Segoe UI Symbol" w:eastAsia="Segoe UI Symbol" w:hAnsi="Segoe UI Symbol"/>
           <w:color w:val="134E4A"/>
-          <w:sz w:val="22"/>
-          <w:szCs w:val="22"/>
+          <w:sz w:val="24"/>
+          <w:szCs w:val="24"/>
         </w:rPr>
-        <w:t xml:space="preserve">○</w:t>
+        <w:t xml:space="preserve">◐</w:t>
       </w:r>
       <w:r>
         <w:rPr>
@@ -10960,7 +10880,7 @@
           <w:sz w:val="18"/>
           <w:szCs w:val="18"/>
         </w:rPr>
-        <w:t xml:space="preserve">  Contribue à la mission</w:t>
+        <w:t xml:space="preserve">  Demi-lune : contribue à la mission</w:t>
       </w:r>
     </w:p>
     <w:tbl>

</xml_diff>